<commit_message>
Deployed 242e903 with MkDocs version: 1.6.1
</commit_message>
<xml_diff>
--- a/tema2/plantillas/Actividad_2_2_INU_Plantilla.docx
+++ b/tema2/plantillas/Actividad_2_2_INU_Plantilla.docx
@@ -167,7 +167,7 @@
                 <w:sz w:val="20"/>
                 <w:szCs w:val="20"/>
               </w:rPr>
-              <w:t xml:space="preserve">Identificador de recursos usado (ej. tablon-publica-&lt;tu-identificador&gt;): _______________________</w:t>
+              <w:t xml:space="preserve">Identificador de recursos usado (ej. pistas-app-publica-&lt;tu-identificador&gt;): _______________________</w:t>
             </w:r>
           </w:p>
         </w:tc>
@@ -618,6 +618,402 @@
     </w:tbl>
     <w:p>
       <w:pPr>
+        <w:spacing w:after="120"/>
+      </w:pPr>
+    </w:p>
+    <w:tbl>
+      <w:tblPr>
+        <w:tblW w:type="dxa" w:w="9638"/>
+        <w:tblBorders>
+          <w:top w:val="single" w:color="auto" w:sz="4"/>
+          <w:left w:val="single" w:color="auto" w:sz="4"/>
+          <w:bottom w:val="single" w:color="auto" w:sz="4"/>
+          <w:right w:val="single" w:color="auto" w:sz="4"/>
+          <w:insideH w:val="single" w:color="auto" w:sz="4"/>
+          <w:insideV w:val="single" w:color="auto" w:sz="4"/>
+        </w:tblBorders>
+      </w:tblPr>
+      <w:tblGrid>
+        <w:gridCol w:w="9638"/>
+      </w:tblGrid>
+      <w:tr>
+        <w:tc>
+          <w:tcPr>
+            <w:tcW w:type="dxa" w:w="9638"/>
+            <w:tcBorders>
+              <w:top w:val="none" w:color="FFFFFF" w:sz="0"/>
+              <w:left w:val="none" w:color="FFFFFF" w:sz="0"/>
+              <w:bottom w:val="none" w:color="FFFFFF" w:sz="0"/>
+              <w:right w:val="none" w:color="FFFFFF" w:sz="0"/>
+            </w:tcBorders>
+            <w:shd w:fill="3949AB" w:val="clear"/>
+            <w:tcMar>
+              <w:top w:type="dxa" w:w="80"/>
+              <w:left w:type="dxa" w:w="160"/>
+              <w:bottom w:type="dxa" w:w="80"/>
+              <w:right w:type="dxa" w:w="160"/>
+            </w:tcMar>
+          </w:tcPr>
+          <w:p>
+            <w:r>
+              <w:rPr>
+                <w:rFonts w:ascii="Arial" w:cs="Arial" w:eastAsia="Arial" w:hAnsi="Arial"/>
+                <w:b/>
+                <w:bCs/>
+                <w:color w:val="FFFFFF"/>
+                <w:sz w:val="20"/>
+                <w:szCs w:val="20"/>
+              </w:rPr>
+              <w:t xml:space="preserve">📸 Ping sin respuesta desde dentro de la privada, todavía sin la pasarela NAT</w:t>
+            </w:r>
+          </w:p>
+        </w:tc>
+      </w:tr>
+      <w:tr>
+        <w:trPr>
+          <w:trHeight w:val="2400"/>
+        </w:trPr>
+        <w:tc>
+          <w:tcPr>
+            <w:tcW w:type="dxa" w:w="9638"/>
+            <w:tcBorders>
+              <w:top w:val="single" w:color="E0E0E0" w:sz="4"/>
+              <w:left w:val="single" w:color="E0E0E0" w:sz="4"/>
+              <w:bottom w:val="single" w:color="E0E0E0" w:sz="4"/>
+              <w:right w:val="single" w:color="E0E0E0" w:sz="4"/>
+            </w:tcBorders>
+            <w:shd w:fill="FAFAFA" w:val="clear"/>
+            <w:tcMar>
+              <w:top w:type="dxa" w:w="80"/>
+              <w:left w:type="dxa" w:w="160"/>
+              <w:bottom w:type="dxa" w:w="80"/>
+              <w:right w:type="dxa" w:w="160"/>
+            </w:tcMar>
+          </w:tcPr>
+          <w:p>
+            <w:pPr>
+              <w:jc w:val="center"/>
+            </w:pPr>
+            <w:r>
+              <w:rPr>
+                <w:rFonts w:ascii="Arial" w:cs="Arial" w:eastAsia="Arial" w:hAnsi="Arial"/>
+                <w:i/>
+                <w:iCs/>
+                <w:color w:val="757575"/>
+                <w:sz w:val="20"/>
+                <w:szCs w:val="20"/>
+              </w:rPr>
+              <w:t xml:space="preserve">[Pega aquí la captura de pantalla]</w:t>
+            </w:r>
+          </w:p>
+        </w:tc>
+      </w:tr>
+    </w:tbl>
+    <w:p>
+      <w:pPr>
+        <w:spacing w:after="200"/>
+      </w:pPr>
+    </w:p>
+    <w:p>
+      <w:r>
+        <w:br w:type="page"/>
+      </w:r>
+    </w:p>
+    <w:p>
+      <w:pPr>
+        <w:pBdr>
+          <w:bottom w:val="single" w:color="FFA000" w:sz="4" w:space="1"/>
+        </w:pBdr>
+        <w:spacing w:after="120" w:before="240"/>
+      </w:pPr>
+      <w:r>
+        <w:rPr>
+          <w:rFonts w:ascii="Arial" w:cs="Arial" w:eastAsia="Arial" w:hAnsi="Arial"/>
+          <w:b/>
+          <w:bCs/>
+          <w:color w:val="3949AB"/>
+          <w:sz w:val="24"/>
+          <w:szCs w:val="24"/>
+        </w:rPr>
+        <w:t xml:space="preserve">Paso 3 — Crea una pasarela NAT para la subred privada</w:t>
+      </w:r>
+    </w:p>
+    <w:tbl>
+      <w:tblPr>
+        <w:tblW w:type="dxa" w:w="9638"/>
+        <w:tblBorders>
+          <w:top w:val="single" w:color="auto" w:sz="4"/>
+          <w:left w:val="single" w:color="auto" w:sz="4"/>
+          <w:bottom w:val="single" w:color="auto" w:sz="4"/>
+          <w:right w:val="single" w:color="auto" w:sz="4"/>
+          <w:insideH w:val="single" w:color="auto" w:sz="4"/>
+          <w:insideV w:val="single" w:color="auto" w:sz="4"/>
+        </w:tblBorders>
+      </w:tblPr>
+      <w:tblGrid>
+        <w:gridCol w:w="9638"/>
+      </w:tblGrid>
+      <w:tr>
+        <w:tc>
+          <w:tcPr>
+            <w:tcW w:type="dxa" w:w="9638"/>
+            <w:tcBorders>
+              <w:top w:val="none" w:color="FFFFFF" w:sz="0"/>
+              <w:left w:val="none" w:color="FFFFFF" w:sz="0"/>
+              <w:bottom w:val="none" w:color="FFFFFF" w:sz="0"/>
+              <w:right w:val="none" w:color="FFFFFF" w:sz="0"/>
+            </w:tcBorders>
+            <w:shd w:fill="3949AB" w:val="clear"/>
+            <w:tcMar>
+              <w:top w:type="dxa" w:w="80"/>
+              <w:left w:type="dxa" w:w="160"/>
+              <w:bottom w:type="dxa" w:w="80"/>
+              <w:right w:type="dxa" w:w="160"/>
+            </w:tcMar>
+          </w:tcPr>
+          <w:p>
+            <w:r>
+              <w:rPr>
+                <w:rFonts w:ascii="Arial" w:cs="Arial" w:eastAsia="Arial" w:hAnsi="Arial"/>
+                <w:b/>
+                <w:bCs/>
+                <w:color w:val="FFFFFF"/>
+                <w:sz w:val="20"/>
+                <w:szCs w:val="20"/>
+              </w:rPr>
+              <w:t xml:space="preserve">📸 Tu pasarela NAT en estado Available</w:t>
+            </w:r>
+          </w:p>
+        </w:tc>
+      </w:tr>
+      <w:tr>
+        <w:trPr>
+          <w:trHeight w:val="2400"/>
+        </w:trPr>
+        <w:tc>
+          <w:tcPr>
+            <w:tcW w:type="dxa" w:w="9638"/>
+            <w:tcBorders>
+              <w:top w:val="single" w:color="E0E0E0" w:sz="4"/>
+              <w:left w:val="single" w:color="E0E0E0" w:sz="4"/>
+              <w:bottom w:val="single" w:color="E0E0E0" w:sz="4"/>
+              <w:right w:val="single" w:color="E0E0E0" w:sz="4"/>
+            </w:tcBorders>
+            <w:shd w:fill="FAFAFA" w:val="clear"/>
+            <w:tcMar>
+              <w:top w:type="dxa" w:w="80"/>
+              <w:left w:type="dxa" w:w="160"/>
+              <w:bottom w:type="dxa" w:w="80"/>
+              <w:right w:type="dxa" w:w="160"/>
+            </w:tcMar>
+          </w:tcPr>
+          <w:p>
+            <w:pPr>
+              <w:jc w:val="center"/>
+            </w:pPr>
+            <w:r>
+              <w:rPr>
+                <w:rFonts w:ascii="Arial" w:cs="Arial" w:eastAsia="Arial" w:hAnsi="Arial"/>
+                <w:i/>
+                <w:iCs/>
+                <w:color w:val="757575"/>
+                <w:sz w:val="20"/>
+                <w:szCs w:val="20"/>
+              </w:rPr>
+              <w:t xml:space="preserve">[Pega aquí la captura de pantalla]</w:t>
+            </w:r>
+          </w:p>
+        </w:tc>
+      </w:tr>
+    </w:tbl>
+    <w:p>
+      <w:pPr>
+        <w:spacing w:after="120"/>
+      </w:pPr>
+    </w:p>
+    <w:tbl>
+      <w:tblPr>
+        <w:tblW w:type="dxa" w:w="9638"/>
+        <w:tblBorders>
+          <w:top w:val="single" w:color="auto" w:sz="4"/>
+          <w:left w:val="single" w:color="auto" w:sz="4"/>
+          <w:bottom w:val="single" w:color="auto" w:sz="4"/>
+          <w:right w:val="single" w:color="auto" w:sz="4"/>
+          <w:insideH w:val="single" w:color="auto" w:sz="4"/>
+          <w:insideV w:val="single" w:color="auto" w:sz="4"/>
+        </w:tblBorders>
+      </w:tblPr>
+      <w:tblGrid>
+        <w:gridCol w:w="9638"/>
+      </w:tblGrid>
+      <w:tr>
+        <w:tc>
+          <w:tcPr>
+            <w:tcW w:type="dxa" w:w="9638"/>
+            <w:tcBorders>
+              <w:top w:val="none" w:color="FFFFFF" w:sz="0"/>
+              <w:left w:val="none" w:color="FFFFFF" w:sz="0"/>
+              <w:bottom w:val="none" w:color="FFFFFF" w:sz="0"/>
+              <w:right w:val="none" w:color="FFFFFF" w:sz="0"/>
+            </w:tcBorders>
+            <w:shd w:fill="3949AB" w:val="clear"/>
+            <w:tcMar>
+              <w:top w:type="dxa" w:w="80"/>
+              <w:left w:type="dxa" w:w="160"/>
+              <w:bottom w:type="dxa" w:w="80"/>
+              <w:right w:type="dxa" w:w="160"/>
+            </w:tcMar>
+          </w:tcPr>
+          <w:p>
+            <w:r>
+              <w:rPr>
+                <w:rFonts w:ascii="Arial" w:cs="Arial" w:eastAsia="Arial" w:hAnsi="Arial"/>
+                <w:b/>
+                <w:bCs/>
+                <w:color w:val="FFFFFF"/>
+                <w:sz w:val="20"/>
+                <w:szCs w:val="20"/>
+              </w:rPr>
+              <w:t xml:space="preserve">📸 Tabla de rutas de la subred privada, con la nueva ruta 0.0.0.0/0 hacia la pasarela NAT</w:t>
+            </w:r>
+          </w:p>
+        </w:tc>
+      </w:tr>
+      <w:tr>
+        <w:trPr>
+          <w:trHeight w:val="2400"/>
+        </w:trPr>
+        <w:tc>
+          <w:tcPr>
+            <w:tcW w:type="dxa" w:w="9638"/>
+            <w:tcBorders>
+              <w:top w:val="single" w:color="E0E0E0" w:sz="4"/>
+              <w:left w:val="single" w:color="E0E0E0" w:sz="4"/>
+              <w:bottom w:val="single" w:color="E0E0E0" w:sz="4"/>
+              <w:right w:val="single" w:color="E0E0E0" w:sz="4"/>
+            </w:tcBorders>
+            <w:shd w:fill="FAFAFA" w:val="clear"/>
+            <w:tcMar>
+              <w:top w:type="dxa" w:w="80"/>
+              <w:left w:type="dxa" w:w="160"/>
+              <w:bottom w:type="dxa" w:w="80"/>
+              <w:right w:type="dxa" w:w="160"/>
+            </w:tcMar>
+          </w:tcPr>
+          <w:p>
+            <w:pPr>
+              <w:jc w:val="center"/>
+            </w:pPr>
+            <w:r>
+              <w:rPr>
+                <w:rFonts w:ascii="Arial" w:cs="Arial" w:eastAsia="Arial" w:hAnsi="Arial"/>
+                <w:i/>
+                <w:iCs/>
+                <w:color w:val="757575"/>
+                <w:sz w:val="20"/>
+                <w:szCs w:val="20"/>
+              </w:rPr>
+              <w:t xml:space="preserve">[Pega aquí la captura de pantalla]</w:t>
+            </w:r>
+          </w:p>
+        </w:tc>
+      </w:tr>
+    </w:tbl>
+    <w:p>
+      <w:pPr>
+        <w:spacing w:after="120"/>
+      </w:pPr>
+    </w:p>
+    <w:tbl>
+      <w:tblPr>
+        <w:tblW w:type="dxa" w:w="9638"/>
+        <w:tblBorders>
+          <w:top w:val="single" w:color="auto" w:sz="4"/>
+          <w:left w:val="single" w:color="auto" w:sz="4"/>
+          <w:bottom w:val="single" w:color="auto" w:sz="4"/>
+          <w:right w:val="single" w:color="auto" w:sz="4"/>
+          <w:insideH w:val="single" w:color="auto" w:sz="4"/>
+          <w:insideV w:val="single" w:color="auto" w:sz="4"/>
+        </w:tblBorders>
+      </w:tblPr>
+      <w:tblGrid>
+        <w:gridCol w:w="9638"/>
+      </w:tblGrid>
+      <w:tr>
+        <w:tc>
+          <w:tcPr>
+            <w:tcW w:type="dxa" w:w="9638"/>
+            <w:tcBorders>
+              <w:top w:val="none" w:color="FFFFFF" w:sz="0"/>
+              <w:left w:val="none" w:color="FFFFFF" w:sz="0"/>
+              <w:bottom w:val="none" w:color="FFFFFF" w:sz="0"/>
+              <w:right w:val="none" w:color="FFFFFF" w:sz="0"/>
+            </w:tcBorders>
+            <w:shd w:fill="3949AB" w:val="clear"/>
+            <w:tcMar>
+              <w:top w:type="dxa" w:w="80"/>
+              <w:left w:type="dxa" w:w="160"/>
+              <w:bottom w:type="dxa" w:w="80"/>
+              <w:right w:type="dxa" w:w="160"/>
+            </w:tcMar>
+          </w:tcPr>
+          <w:p>
+            <w:r>
+              <w:rPr>
+                <w:rFonts w:ascii="Arial" w:cs="Arial" w:eastAsia="Arial" w:hAnsi="Arial"/>
+                <w:b/>
+                <w:bCs/>
+                <w:color w:val="FFFFFF"/>
+                <w:sz w:val="20"/>
+                <w:szCs w:val="20"/>
+              </w:rPr>
+              <w:t xml:space="preserve">📸 Salida del ping con respuesta, ejecutado desde dentro de la instancia privada</w:t>
+            </w:r>
+          </w:p>
+        </w:tc>
+      </w:tr>
+      <w:tr>
+        <w:trPr>
+          <w:trHeight w:val="2400"/>
+        </w:trPr>
+        <w:tc>
+          <w:tcPr>
+            <w:tcW w:type="dxa" w:w="9638"/>
+            <w:tcBorders>
+              <w:top w:val="single" w:color="E0E0E0" w:sz="4"/>
+              <w:left w:val="single" w:color="E0E0E0" w:sz="4"/>
+              <w:bottom w:val="single" w:color="E0E0E0" w:sz="4"/>
+              <w:right w:val="single" w:color="E0E0E0" w:sz="4"/>
+            </w:tcBorders>
+            <w:shd w:fill="FAFAFA" w:val="clear"/>
+            <w:tcMar>
+              <w:top w:type="dxa" w:w="80"/>
+              <w:left w:type="dxa" w:w="160"/>
+              <w:bottom w:type="dxa" w:w="80"/>
+              <w:right w:type="dxa" w:w="160"/>
+            </w:tcMar>
+          </w:tcPr>
+          <w:p>
+            <w:pPr>
+              <w:jc w:val="center"/>
+            </w:pPr>
+            <w:r>
+              <w:rPr>
+                <w:rFonts w:ascii="Arial" w:cs="Arial" w:eastAsia="Arial" w:hAnsi="Arial"/>
+                <w:i/>
+                <w:iCs/>
+                <w:color w:val="757575"/>
+                <w:sz w:val="20"/>
+                <w:szCs w:val="20"/>
+              </w:rPr>
+              <w:t xml:space="preserve">[Pega aquí la captura de pantalla]</w:t>
+            </w:r>
+          </w:p>
+        </w:tc>
+      </w:tr>
+    </w:tbl>
+    <w:p>
+      <w:pPr>
         <w:spacing w:after="200"/>
       </w:pPr>
     </w:p>
@@ -641,7 +1037,7 @@
           <w:sz w:val="26"/>
           <w:szCs w:val="26"/>
         </w:rPr>
-        <w:t xml:space="preserve">Parte B — Reto: arregla esta red</w:t>
+        <w:t xml:space="preserve">Parte B — Diagnostica tu avería</w:t>
       </w:r>
     </w:p>
     <w:p>
@@ -665,7 +1061,7 @@
           <w:sz w:val="24"/>
           <w:szCs w:val="24"/>
         </w:rPr>
-        <w:t xml:space="preserve">Cuatro fichas de diagnóstico</w:t>
+        <w:t xml:space="preserve">Ficha de diagnóstico de tu avería</w:t>
       </w:r>
     </w:p>
     <w:p>
@@ -679,7 +1075,7 @@
           <w:sz w:val="22"/>
           <w:szCs w:val="22"/>
         </w:rPr>
-        <w:t xml:space="preserve">Para cada una de las cuatro averías (ruta incorrecta, grupo de seguridad cerrado, regla de NACL bloqueante, instancia parada), documenta: síntoma observado, capa revisada primero y por qué, comando o comprobación que localizó el problema, y cómo lo corregiste.</w:t>
+        <w:t xml:space="preserve">Documenta la avería que te ha tocado (ruta incorrecta, grupo de seguridad cerrado o regla de NACL bloqueante — solo una): síntoma observado, capa revisada primero y por qué, qué has visto en la consola que localizó el problema, y cómo lo corregiste. Tanto el diagnóstico como la corrección se hacen desde la consola de AWS, sin comandos.</w:t>
       </w:r>
     </w:p>
     <w:tbl>
@@ -799,7 +1195,7 @@
                 <w:sz w:val="20"/>
                 <w:szCs w:val="20"/>
               </w:rPr>
-              <w:t xml:space="preserve">Comando de diagnóstico</w:t>
+              <w:t xml:space="preserve">Qué has visto en la consola</w:t>
             </w:r>
           </w:p>
         </w:tc>
@@ -951,388 +1347,11 @@
           </w:p>
         </w:tc>
       </w:tr>
-      <w:tr>
-        <w:trPr>
-          <w:trHeight w:val="800"/>
-        </w:trPr>
-        <w:tc>
-          <w:tcPr>
-            <w:tcW w:type="dxa" w:w="1735"/>
-            <w:tcBorders>
-              <w:top w:val="single" w:color="E0E0E0" w:sz="4"/>
-              <w:left w:val="single" w:color="E0E0E0" w:sz="4"/>
-              <w:bottom w:val="single" w:color="E0E0E0" w:sz="4"/>
-              <w:right w:val="single" w:color="E0E0E0" w:sz="4"/>
-            </w:tcBorders>
-            <w:shd w:fill="F5F5F5" w:val="clear"/>
-            <w:tcMar>
-              <w:top w:type="dxa" w:w="80"/>
-              <w:left w:type="dxa" w:w="140"/>
-              <w:bottom w:type="dxa" w:w="80"/>
-              <w:right w:type="dxa" w:w="100"/>
-            </w:tcMar>
-          </w:tcPr>
-          <w:p>
-            <w:r>
-              <w:rPr>
-                <w:sz w:val="22"/>
-                <w:szCs w:val="22"/>
-              </w:rPr>
-              <w:t xml:space="preserve"/>
-            </w:r>
-          </w:p>
-        </w:tc>
-        <w:tc>
-          <w:tcPr>
-            <w:tcW w:type="dxa" w:w="2891"/>
-            <w:tcBorders>
-              <w:top w:val="single" w:color="E0E0E0" w:sz="4"/>
-              <w:left w:val="single" w:color="E0E0E0" w:sz="4"/>
-              <w:bottom w:val="single" w:color="E0E0E0" w:sz="4"/>
-              <w:right w:val="single" w:color="E0E0E0" w:sz="4"/>
-            </w:tcBorders>
-            <w:shd w:fill="F5F5F5" w:val="clear"/>
-            <w:tcMar>
-              <w:top w:type="dxa" w:w="80"/>
-              <w:left w:type="dxa" w:w="140"/>
-              <w:bottom w:type="dxa" w:w="80"/>
-              <w:right w:type="dxa" w:w="100"/>
-            </w:tcMar>
-          </w:tcPr>
-          <w:p>
-            <w:r>
-              <w:rPr>
-                <w:sz w:val="22"/>
-                <w:szCs w:val="22"/>
-              </w:rPr>
-              <w:t xml:space="preserve"/>
-            </w:r>
-          </w:p>
-        </w:tc>
-        <w:tc>
-          <w:tcPr>
-            <w:tcW w:type="dxa" w:w="2313"/>
-            <w:tcBorders>
-              <w:top w:val="single" w:color="E0E0E0" w:sz="4"/>
-              <w:left w:val="single" w:color="E0E0E0" w:sz="4"/>
-              <w:bottom w:val="single" w:color="E0E0E0" w:sz="4"/>
-              <w:right w:val="single" w:color="E0E0E0" w:sz="4"/>
-            </w:tcBorders>
-            <w:shd w:fill="F5F5F5" w:val="clear"/>
-            <w:tcMar>
-              <w:top w:type="dxa" w:w="80"/>
-              <w:left w:type="dxa" w:w="140"/>
-              <w:bottom w:type="dxa" w:w="80"/>
-              <w:right w:type="dxa" w:w="100"/>
-            </w:tcMar>
-          </w:tcPr>
-          <w:p>
-            <w:r>
-              <w:rPr>
-                <w:sz w:val="22"/>
-                <w:szCs w:val="22"/>
-              </w:rPr>
-              <w:t xml:space="preserve"/>
-            </w:r>
-          </w:p>
-        </w:tc>
-        <w:tc>
-          <w:tcPr>
-            <w:tcW w:type="dxa" w:w="2699"/>
-            <w:tcBorders>
-              <w:top w:val="single" w:color="E0E0E0" w:sz="4"/>
-              <w:left w:val="single" w:color="E0E0E0" w:sz="4"/>
-              <w:bottom w:val="single" w:color="E0E0E0" w:sz="4"/>
-              <w:right w:val="single" w:color="E0E0E0" w:sz="4"/>
-            </w:tcBorders>
-            <w:shd w:fill="F5F5F5" w:val="clear"/>
-            <w:tcMar>
-              <w:top w:type="dxa" w:w="80"/>
-              <w:left w:type="dxa" w:w="140"/>
-              <w:bottom w:type="dxa" w:w="80"/>
-              <w:right w:type="dxa" w:w="100"/>
-            </w:tcMar>
-          </w:tcPr>
-          <w:p>
-            <w:r>
-              <w:rPr>
-                <w:sz w:val="22"/>
-                <w:szCs w:val="22"/>
-              </w:rPr>
-              <w:t xml:space="preserve"/>
-            </w:r>
-          </w:p>
-        </w:tc>
-      </w:tr>
-      <w:tr>
-        <w:trPr>
-          <w:trHeight w:val="800"/>
-        </w:trPr>
-        <w:tc>
-          <w:tcPr>
-            <w:tcW w:type="dxa" w:w="1735"/>
-            <w:tcBorders>
-              <w:top w:val="single" w:color="E0E0E0" w:sz="4"/>
-              <w:left w:val="single" w:color="E0E0E0" w:sz="4"/>
-              <w:bottom w:val="single" w:color="E0E0E0" w:sz="4"/>
-              <w:right w:val="single" w:color="E0E0E0" w:sz="4"/>
-            </w:tcBorders>
-            <w:shd w:fill="FFFFFF" w:val="clear"/>
-            <w:tcMar>
-              <w:top w:type="dxa" w:w="80"/>
-              <w:left w:type="dxa" w:w="140"/>
-              <w:bottom w:type="dxa" w:w="80"/>
-              <w:right w:type="dxa" w:w="100"/>
-            </w:tcMar>
-          </w:tcPr>
-          <w:p>
-            <w:r>
-              <w:rPr>
-                <w:sz w:val="22"/>
-                <w:szCs w:val="22"/>
-              </w:rPr>
-              <w:t xml:space="preserve"/>
-            </w:r>
-          </w:p>
-        </w:tc>
-        <w:tc>
-          <w:tcPr>
-            <w:tcW w:type="dxa" w:w="2891"/>
-            <w:tcBorders>
-              <w:top w:val="single" w:color="E0E0E0" w:sz="4"/>
-              <w:left w:val="single" w:color="E0E0E0" w:sz="4"/>
-              <w:bottom w:val="single" w:color="E0E0E0" w:sz="4"/>
-              <w:right w:val="single" w:color="E0E0E0" w:sz="4"/>
-            </w:tcBorders>
-            <w:shd w:fill="FFFFFF" w:val="clear"/>
-            <w:tcMar>
-              <w:top w:type="dxa" w:w="80"/>
-              <w:left w:type="dxa" w:w="140"/>
-              <w:bottom w:type="dxa" w:w="80"/>
-              <w:right w:type="dxa" w:w="100"/>
-            </w:tcMar>
-          </w:tcPr>
-          <w:p>
-            <w:r>
-              <w:rPr>
-                <w:sz w:val="22"/>
-                <w:szCs w:val="22"/>
-              </w:rPr>
-              <w:t xml:space="preserve"/>
-            </w:r>
-          </w:p>
-        </w:tc>
-        <w:tc>
-          <w:tcPr>
-            <w:tcW w:type="dxa" w:w="2313"/>
-            <w:tcBorders>
-              <w:top w:val="single" w:color="E0E0E0" w:sz="4"/>
-              <w:left w:val="single" w:color="E0E0E0" w:sz="4"/>
-              <w:bottom w:val="single" w:color="E0E0E0" w:sz="4"/>
-              <w:right w:val="single" w:color="E0E0E0" w:sz="4"/>
-            </w:tcBorders>
-            <w:shd w:fill="FFFFFF" w:val="clear"/>
-            <w:tcMar>
-              <w:top w:type="dxa" w:w="80"/>
-              <w:left w:type="dxa" w:w="140"/>
-              <w:bottom w:type="dxa" w:w="80"/>
-              <w:right w:type="dxa" w:w="100"/>
-            </w:tcMar>
-          </w:tcPr>
-          <w:p>
-            <w:r>
-              <w:rPr>
-                <w:sz w:val="22"/>
-                <w:szCs w:val="22"/>
-              </w:rPr>
-              <w:t xml:space="preserve"/>
-            </w:r>
-          </w:p>
-        </w:tc>
-        <w:tc>
-          <w:tcPr>
-            <w:tcW w:type="dxa" w:w="2699"/>
-            <w:tcBorders>
-              <w:top w:val="single" w:color="E0E0E0" w:sz="4"/>
-              <w:left w:val="single" w:color="E0E0E0" w:sz="4"/>
-              <w:bottom w:val="single" w:color="E0E0E0" w:sz="4"/>
-              <w:right w:val="single" w:color="E0E0E0" w:sz="4"/>
-            </w:tcBorders>
-            <w:shd w:fill="FFFFFF" w:val="clear"/>
-            <w:tcMar>
-              <w:top w:type="dxa" w:w="80"/>
-              <w:left w:type="dxa" w:w="140"/>
-              <w:bottom w:type="dxa" w:w="80"/>
-              <w:right w:type="dxa" w:w="100"/>
-            </w:tcMar>
-          </w:tcPr>
-          <w:p>
-            <w:r>
-              <w:rPr>
-                <w:sz w:val="22"/>
-                <w:szCs w:val="22"/>
-              </w:rPr>
-              <w:t xml:space="preserve"/>
-            </w:r>
-          </w:p>
-        </w:tc>
-      </w:tr>
-      <w:tr>
-        <w:trPr>
-          <w:trHeight w:val="800"/>
-        </w:trPr>
-        <w:tc>
-          <w:tcPr>
-            <w:tcW w:type="dxa" w:w="1735"/>
-            <w:tcBorders>
-              <w:top w:val="single" w:color="E0E0E0" w:sz="4"/>
-              <w:left w:val="single" w:color="E0E0E0" w:sz="4"/>
-              <w:bottom w:val="single" w:color="E0E0E0" w:sz="4"/>
-              <w:right w:val="single" w:color="E0E0E0" w:sz="4"/>
-            </w:tcBorders>
-            <w:shd w:fill="F5F5F5" w:val="clear"/>
-            <w:tcMar>
-              <w:top w:type="dxa" w:w="80"/>
-              <w:left w:type="dxa" w:w="140"/>
-              <w:bottom w:type="dxa" w:w="80"/>
-              <w:right w:type="dxa" w:w="100"/>
-            </w:tcMar>
-          </w:tcPr>
-          <w:p>
-            <w:r>
-              <w:rPr>
-                <w:sz w:val="22"/>
-                <w:szCs w:val="22"/>
-              </w:rPr>
-              <w:t xml:space="preserve"/>
-            </w:r>
-          </w:p>
-        </w:tc>
-        <w:tc>
-          <w:tcPr>
-            <w:tcW w:type="dxa" w:w="2891"/>
-            <w:tcBorders>
-              <w:top w:val="single" w:color="E0E0E0" w:sz="4"/>
-              <w:left w:val="single" w:color="E0E0E0" w:sz="4"/>
-              <w:bottom w:val="single" w:color="E0E0E0" w:sz="4"/>
-              <w:right w:val="single" w:color="E0E0E0" w:sz="4"/>
-            </w:tcBorders>
-            <w:shd w:fill="F5F5F5" w:val="clear"/>
-            <w:tcMar>
-              <w:top w:type="dxa" w:w="80"/>
-              <w:left w:type="dxa" w:w="140"/>
-              <w:bottom w:type="dxa" w:w="80"/>
-              <w:right w:type="dxa" w:w="100"/>
-            </w:tcMar>
-          </w:tcPr>
-          <w:p>
-            <w:r>
-              <w:rPr>
-                <w:sz w:val="22"/>
-                <w:szCs w:val="22"/>
-              </w:rPr>
-              <w:t xml:space="preserve"/>
-            </w:r>
-          </w:p>
-        </w:tc>
-        <w:tc>
-          <w:tcPr>
-            <w:tcW w:type="dxa" w:w="2313"/>
-            <w:tcBorders>
-              <w:top w:val="single" w:color="E0E0E0" w:sz="4"/>
-              <w:left w:val="single" w:color="E0E0E0" w:sz="4"/>
-              <w:bottom w:val="single" w:color="E0E0E0" w:sz="4"/>
-              <w:right w:val="single" w:color="E0E0E0" w:sz="4"/>
-            </w:tcBorders>
-            <w:shd w:fill="F5F5F5" w:val="clear"/>
-            <w:tcMar>
-              <w:top w:type="dxa" w:w="80"/>
-              <w:left w:type="dxa" w:w="140"/>
-              <w:bottom w:type="dxa" w:w="80"/>
-              <w:right w:type="dxa" w:w="100"/>
-            </w:tcMar>
-          </w:tcPr>
-          <w:p>
-            <w:r>
-              <w:rPr>
-                <w:sz w:val="22"/>
-                <w:szCs w:val="22"/>
-              </w:rPr>
-              <w:t xml:space="preserve"/>
-            </w:r>
-          </w:p>
-        </w:tc>
-        <w:tc>
-          <w:tcPr>
-            <w:tcW w:type="dxa" w:w="2699"/>
-            <w:tcBorders>
-              <w:top w:val="single" w:color="E0E0E0" w:sz="4"/>
-              <w:left w:val="single" w:color="E0E0E0" w:sz="4"/>
-              <w:bottom w:val="single" w:color="E0E0E0" w:sz="4"/>
-              <w:right w:val="single" w:color="E0E0E0" w:sz="4"/>
-            </w:tcBorders>
-            <w:shd w:fill="F5F5F5" w:val="clear"/>
-            <w:tcMar>
-              <w:top w:type="dxa" w:w="80"/>
-              <w:left w:type="dxa" w:w="140"/>
-              <w:bottom w:type="dxa" w:w="80"/>
-              <w:right w:type="dxa" w:w="100"/>
-            </w:tcMar>
-          </w:tcPr>
-          <w:p>
-            <w:r>
-              <w:rPr>
-                <w:sz w:val="22"/>
-                <w:szCs w:val="22"/>
-              </w:rPr>
-              <w:t xml:space="preserve"/>
-            </w:r>
-          </w:p>
-        </w:tc>
-      </w:tr>
     </w:tbl>
     <w:p>
       <w:pPr>
-        <w:spacing w:after="200"/>
-      </w:pPr>
-    </w:p>
-    <w:p>
-      <w:r>
-        <w:br w:type="page"/>
-      </w:r>
-    </w:p>
-    <w:p>
-      <w:pPr>
-        <w:pBdr>
-          <w:bottom w:val="single" w:color="FFA000" w:sz="4" w:space="1"/>
-        </w:pBdr>
-        <w:spacing w:after="120" w:before="240"/>
-      </w:pPr>
-      <w:r>
-        <w:rPr>
-          <w:rFonts w:ascii="Arial" w:cs="Arial" w:eastAsia="Arial" w:hAnsi="Arial"/>
-          <w:b/>
-          <w:bCs/>
-          <w:color w:val="3949AB"/>
-          <w:sz w:val="24"/>
-          <w:szCs w:val="24"/>
-        </w:rPr>
-        <w:t xml:space="preserve">Coste mensual de la pasarela NAT</w:t>
-      </w:r>
-    </w:p>
-    <w:p>
-      <w:pPr>
-        <w:spacing w:after="100"/>
-      </w:pPr>
-      <w:r>
-        <w:rPr>
-          <w:rFonts w:ascii="Arial" w:cs="Arial" w:eastAsia="Arial" w:hAnsi="Arial"/>
-          <w:color w:val="212121"/>
-          <w:sz w:val="22"/>
-          <w:szCs w:val="22"/>
-        </w:rPr>
-        <w:t xml:space="preserve">Desglose de coste mensual estimado de la pasarela NAT (precio por hora + estimación de GB de tráfico saliente de las instancias privadas).</w:t>
-      </w:r>
+        <w:spacing w:after="120"/>
+      </w:pPr>
     </w:p>
     <w:tbl>
       <w:tblPr>
@@ -1377,6 +1396,230 @@
                 <w:sz w:val="20"/>
                 <w:szCs w:val="20"/>
               </w:rPr>
+              <w:t xml:space="preserve">📸 Problema, antes de corregirlo (la regla, ruta o NACL incorrecta en la consola, o el error al intentar acceder)</w:t>
+            </w:r>
+          </w:p>
+        </w:tc>
+      </w:tr>
+      <w:tr>
+        <w:trPr>
+          <w:trHeight w:val="2400"/>
+        </w:trPr>
+        <w:tc>
+          <w:tcPr>
+            <w:tcW w:type="dxa" w:w="9638"/>
+            <w:tcBorders>
+              <w:top w:val="single" w:color="E0E0E0" w:sz="4"/>
+              <w:left w:val="single" w:color="E0E0E0" w:sz="4"/>
+              <w:bottom w:val="single" w:color="E0E0E0" w:sz="4"/>
+              <w:right w:val="single" w:color="E0E0E0" w:sz="4"/>
+            </w:tcBorders>
+            <w:shd w:fill="FAFAFA" w:val="clear"/>
+            <w:tcMar>
+              <w:top w:type="dxa" w:w="80"/>
+              <w:left w:type="dxa" w:w="160"/>
+              <w:bottom w:type="dxa" w:w="80"/>
+              <w:right w:type="dxa" w:w="160"/>
+            </w:tcMar>
+          </w:tcPr>
+          <w:p>
+            <w:pPr>
+              <w:jc w:val="center"/>
+            </w:pPr>
+            <w:r>
+              <w:rPr>
+                <w:rFonts w:ascii="Arial" w:cs="Arial" w:eastAsia="Arial" w:hAnsi="Arial"/>
+                <w:i/>
+                <w:iCs/>
+                <w:color w:val="757575"/>
+                <w:sz w:val="20"/>
+                <w:szCs w:val="20"/>
+              </w:rPr>
+              <w:t xml:space="preserve">[Pega aquí la captura de pantalla]</w:t>
+            </w:r>
+          </w:p>
+        </w:tc>
+      </w:tr>
+    </w:tbl>
+    <w:p>
+      <w:pPr>
+        <w:spacing w:after="120"/>
+      </w:pPr>
+    </w:p>
+    <w:tbl>
+      <w:tblPr>
+        <w:tblW w:type="dxa" w:w="9638"/>
+        <w:tblBorders>
+          <w:top w:val="single" w:color="auto" w:sz="4"/>
+          <w:left w:val="single" w:color="auto" w:sz="4"/>
+          <w:bottom w:val="single" w:color="auto" w:sz="4"/>
+          <w:right w:val="single" w:color="auto" w:sz="4"/>
+          <w:insideH w:val="single" w:color="auto" w:sz="4"/>
+          <w:insideV w:val="single" w:color="auto" w:sz="4"/>
+        </w:tblBorders>
+      </w:tblPr>
+      <w:tblGrid>
+        <w:gridCol w:w="9638"/>
+      </w:tblGrid>
+      <w:tr>
+        <w:tc>
+          <w:tcPr>
+            <w:tcW w:type="dxa" w:w="9638"/>
+            <w:tcBorders>
+              <w:top w:val="none" w:color="FFFFFF" w:sz="0"/>
+              <w:left w:val="none" w:color="FFFFFF" w:sz="0"/>
+              <w:bottom w:val="none" w:color="FFFFFF" w:sz="0"/>
+              <w:right w:val="none" w:color="FFFFFF" w:sz="0"/>
+            </w:tcBorders>
+            <w:shd w:fill="3949AB" w:val="clear"/>
+            <w:tcMar>
+              <w:top w:type="dxa" w:w="80"/>
+              <w:left w:type="dxa" w:w="160"/>
+              <w:bottom w:type="dxa" w:w="80"/>
+              <w:right w:type="dxa" w:w="160"/>
+            </w:tcMar>
+          </w:tcPr>
+          <w:p>
+            <w:r>
+              <w:rPr>
+                <w:rFonts w:ascii="Arial" w:cs="Arial" w:eastAsia="Arial" w:hAnsi="Arial"/>
+                <w:b/>
+                <w:bCs/>
+                <w:color w:val="FFFFFF"/>
+                <w:sz w:val="20"/>
+                <w:szCs w:val="20"/>
+              </w:rPr>
+              <w:t xml:space="preserve">📸 Ya corregido, después de aplicar el cambio desde la consola</w:t>
+            </w:r>
+          </w:p>
+        </w:tc>
+      </w:tr>
+      <w:tr>
+        <w:trPr>
+          <w:trHeight w:val="2400"/>
+        </w:trPr>
+        <w:tc>
+          <w:tcPr>
+            <w:tcW w:type="dxa" w:w="9638"/>
+            <w:tcBorders>
+              <w:top w:val="single" w:color="E0E0E0" w:sz="4"/>
+              <w:left w:val="single" w:color="E0E0E0" w:sz="4"/>
+              <w:bottom w:val="single" w:color="E0E0E0" w:sz="4"/>
+              <w:right w:val="single" w:color="E0E0E0" w:sz="4"/>
+            </w:tcBorders>
+            <w:shd w:fill="FAFAFA" w:val="clear"/>
+            <w:tcMar>
+              <w:top w:type="dxa" w:w="80"/>
+              <w:left w:type="dxa" w:w="160"/>
+              <w:bottom w:type="dxa" w:w="80"/>
+              <w:right w:type="dxa" w:w="160"/>
+            </w:tcMar>
+          </w:tcPr>
+          <w:p>
+            <w:pPr>
+              <w:jc w:val="center"/>
+            </w:pPr>
+            <w:r>
+              <w:rPr>
+                <w:rFonts w:ascii="Arial" w:cs="Arial" w:eastAsia="Arial" w:hAnsi="Arial"/>
+                <w:i/>
+                <w:iCs/>
+                <w:color w:val="757575"/>
+                <w:sz w:val="20"/>
+                <w:szCs w:val="20"/>
+              </w:rPr>
+              <w:t xml:space="preserve">[Pega aquí la captura de pantalla]</w:t>
+            </w:r>
+          </w:p>
+        </w:tc>
+      </w:tr>
+    </w:tbl>
+    <w:p>
+      <w:pPr>
+        <w:spacing w:after="200"/>
+      </w:pPr>
+    </w:p>
+    <w:p>
+      <w:r>
+        <w:br w:type="page"/>
+      </w:r>
+    </w:p>
+    <w:p>
+      <w:pPr>
+        <w:pBdr>
+          <w:bottom w:val="single" w:color="FFA000" w:sz="4" w:space="1"/>
+        </w:pBdr>
+        <w:spacing w:after="120" w:before="240"/>
+      </w:pPr>
+      <w:r>
+        <w:rPr>
+          <w:rFonts w:ascii="Arial" w:cs="Arial" w:eastAsia="Arial" w:hAnsi="Arial"/>
+          <w:b/>
+          <w:bCs/>
+          <w:color w:val="3949AB"/>
+          <w:sz w:val="24"/>
+          <w:szCs w:val="24"/>
+        </w:rPr>
+        <w:t xml:space="preserve">Coste mensual de la pasarela NAT</w:t>
+      </w:r>
+    </w:p>
+    <w:p>
+      <w:pPr>
+        <w:spacing w:after="100"/>
+      </w:pPr>
+      <w:r>
+        <w:rPr>
+          <w:rFonts w:ascii="Arial" w:cs="Arial" w:eastAsia="Arial" w:hAnsi="Arial"/>
+          <w:color w:val="212121"/>
+          <w:sz w:val="22"/>
+          <w:szCs w:val="22"/>
+        </w:rPr>
+        <w:t xml:space="preserve">Desglose de coste mensual estimado de la pasarela NAT que has creado en la Parte A (precio por hora + estimación de GB de tráfico saliente de las instancias privadas).</w:t>
+      </w:r>
+    </w:p>
+    <w:tbl>
+      <w:tblPr>
+        <w:tblW w:type="dxa" w:w="9638"/>
+        <w:tblBorders>
+          <w:top w:val="single" w:color="auto" w:sz="4"/>
+          <w:left w:val="single" w:color="auto" w:sz="4"/>
+          <w:bottom w:val="single" w:color="auto" w:sz="4"/>
+          <w:right w:val="single" w:color="auto" w:sz="4"/>
+          <w:insideH w:val="single" w:color="auto" w:sz="4"/>
+          <w:insideV w:val="single" w:color="auto" w:sz="4"/>
+        </w:tblBorders>
+      </w:tblPr>
+      <w:tblGrid>
+        <w:gridCol w:w="9638"/>
+      </w:tblGrid>
+      <w:tr>
+        <w:tc>
+          <w:tcPr>
+            <w:tcW w:type="dxa" w:w="9638"/>
+            <w:tcBorders>
+              <w:top w:val="none" w:color="FFFFFF" w:sz="0"/>
+              <w:left w:val="none" w:color="FFFFFF" w:sz="0"/>
+              <w:bottom w:val="none" w:color="FFFFFF" w:sz="0"/>
+              <w:right w:val="none" w:color="FFFFFF" w:sz="0"/>
+            </w:tcBorders>
+            <w:shd w:fill="3949AB" w:val="clear"/>
+            <w:tcMar>
+              <w:top w:type="dxa" w:w="80"/>
+              <w:left w:type="dxa" w:w="160"/>
+              <w:bottom w:type="dxa" w:w="80"/>
+              <w:right w:type="dxa" w:w="160"/>
+            </w:tcMar>
+          </w:tcPr>
+          <w:p>
+            <w:r>
+              <w:rPr>
+                <w:rFonts w:ascii="Arial" w:cs="Arial" w:eastAsia="Arial" w:hAnsi="Arial"/>
+                <w:b/>
+                <w:bCs/>
+                <w:color w:val="FFFFFF"/>
+                <w:sz w:val="20"/>
+                <w:szCs w:val="20"/>
+              </w:rPr>
               <w:t xml:space="preserve">📸 Desglose de coste mensual de la pasarela NAT</w:t>
             </w:r>
           </w:p>
@@ -1457,7 +1700,7 @@
           <w:sz w:val="22"/>
           <w:szCs w:val="22"/>
         </w:rPr>
-        <w:t xml:space="preserve">De las cuatro averías, ¿cuál has confundido primero con otra capa distinta a la que realmente era? Un grupo de seguridad cerrado y una NACL bloqueante producen síntomas muy parecidos desde fuera. ¿Qué comprobación concreta es la que de verdad distingue una de la otra?</w:t>
+        <w:t xml:space="preserve">Compara con un compañero al que le haya tocado una avería distinta a la tuya, sin miraros el código de rompe_red.sh: ¿qué síntoma habéis visto cada uno al entrar por primera vez, y en qué momento del diagnóstico habéis podido distinguir con certeza cuál de las capas estaba fallando? Un grupo de seguridad cerrado y una NACL bloqueante producen síntomas muy parecidos desde fuera — ¿qué comprobación concreta es la que de verdad distingue una de la otra?</w:t>
       </w:r>
     </w:p>
     <w:tbl>

</xml_diff>